<commit_message>
Fixed parens that broke answering interviews AND uploaded content docxes for changing divorce - some still drafts and still need some bitlys
</commit_message>
<xml_diff>
--- a/docassemble/AKA2JBranding/data/templates/sign_content.docx
+++ b/docassemble/AKA2JBranding/data/templates/sign_content.docx
@@ -18,7 +18,9 @@
         <w:t>1.</w:t>
       </w:r>
       <w:r>
-        <w:tab/>
+        <w:t xml:space="preserve">  </w:t>
+      </w:r>
+      <w:r>
         <w:t>If the signature needs to be notarized.</w:t>
       </w:r>
     </w:p>
@@ -30,8 +32,22 @@
         <w:t>2.</w:t>
       </w:r>
       <w:r>
-        <w:tab/>
-        <w:t>If you fill them out a paper copy by hand or use a computer or mobile device.</w:t>
+        <w:t xml:space="preserve">  </w:t>
+      </w:r>
+      <w:r>
+        <w:t>If you fill out a paper copy</w:t>
+      </w:r>
+      <w:r>
+        <w:t>,</w:t>
+      </w:r>
+      <w:r>
+        <w:t xml:space="preserve"> by hand</w:t>
+      </w:r>
+      <w:r>
+        <w:t>,</w:t>
+      </w:r>
+      <w:r>
+        <w:t xml:space="preserve"> or use a computer or mobile device.</w:t>
       </w:r>
     </w:p>
     <w:p>
@@ -42,8 +58,22 @@
         <w:t>3.</w:t>
       </w:r>
       <w:r>
-        <w:tab/>
-        <w:t>If you file mail or hand deliver a paper copy to the court, or use TrueFiling.</w:t>
+        <w:t xml:space="preserve">  </w:t>
+      </w:r>
+      <w:r>
+        <w:t xml:space="preserve">If you file </w:t>
+      </w:r>
+      <w:r>
+        <w:t xml:space="preserve">by </w:t>
+      </w:r>
+      <w:r>
+        <w:t>mail</w:t>
+      </w:r>
+      <w:r>
+        <w:t>,</w:t>
+      </w:r>
+      <w:r>
+        <w:t xml:space="preserve"> or hand deliver a paper copy to the court, or use TrueFiling.</w:t>
       </w:r>
     </w:p>
     <w:p>

</xml_diff>

<commit_message>
spacing bullet points in sign_content templates, docx and mako
</commit_message>
<xml_diff>
--- a/docassemble/AKA2JBranding/data/templates/sign_content.docx
+++ b/docassemble/AKA2JBranding/data/templates/sign_content.docx
@@ -125,7 +125,19 @@
         <w:pStyle w:val="Body"/>
       </w:pPr>
       <w:r>
-        <w:t>If you fill out your forms on a computer but do not file them with TrueFiling or you fill out paper copies by hand:</w:t>
+        <w:t>If you fill out your forms on a computer</w:t>
+      </w:r>
+      <w:r>
+        <w:t>,</w:t>
+      </w:r>
+      <w:r>
+        <w:t xml:space="preserve"> but do not file them with TrueFiling</w:t>
+      </w:r>
+      <w:r>
+        <w:t>,</w:t>
+      </w:r>
+      <w:r>
+        <w:t xml:space="preserve"> or you fill out paper copies by hand:</w:t>
       </w:r>
     </w:p>
     <w:p>
@@ -138,7 +150,17 @@
         <w:ind w:left="360"/>
       </w:pPr>
       <w:r>
-        <w:t>If your form does not need a notarized signature, sign it with a pen.</w:t>
+        <w:t xml:space="preserve">If your form does </w:t>
+      </w:r>
+      <w:r>
+        <w:rPr>
+          <w:b/>
+          <w:bCs/>
+        </w:rPr>
+        <w:t>not need</w:t>
+      </w:r>
+      <w:r>
+        <w:t xml:space="preserve"> a notarized signature, sign it with a pen.</w:t>
       </w:r>
     </w:p>
     <w:p>
@@ -151,7 +173,65 @@
         <w:ind w:left="360"/>
       </w:pPr>
       <w:r>
-        <w:t xml:space="preserve">If your form needs a notarized signature, wait to sign the form until you are in front of someone who has the power to take oaths, like a notary public. If you are filing your documents in person at court, the court clerk can notarize them for free.  Bring a valid photo ID with you.  If you are mailing your documents and do not have access to a notary or court clerk, fill out and file </w:t>
+        <w:t xml:space="preserve">If your form </w:t>
+      </w:r>
+      <w:r>
+        <w:rPr>
+          <w:b/>
+          <w:bCs/>
+        </w:rPr>
+        <w:t>needs</w:t>
+      </w:r>
+      <w:r>
+        <w:t xml:space="preserve"> a notarized signature, wait to sign the form until you are in front of someone who has the power to take oaths, like a notary public.</w:t>
+      </w:r>
+    </w:p>
+    <w:p>
+      <w:pPr>
+        <w:pStyle w:val="Body"/>
+        <w:numPr>
+          <w:ilvl w:val="1"/>
+          <w:numId w:val="46"/>
+        </w:numPr>
+      </w:pPr>
+      <w:r>
+        <w:t>If you fil</w:t>
+      </w:r>
+      <w:r>
+        <w:t>e</w:t>
+      </w:r>
+      <w:r>
+        <w:t xml:space="preserve"> your documents in person</w:t>
+      </w:r>
+      <w:r>
+        <w:t>,</w:t>
+      </w:r>
+      <w:r>
+        <w:t xml:space="preserve"> at court, the court clerk can notarize them for free. Bring a valid photo ID with you.</w:t>
+      </w:r>
+    </w:p>
+    <w:p>
+      <w:pPr>
+        <w:pStyle w:val="Body"/>
+        <w:numPr>
+          <w:ilvl w:val="1"/>
+          <w:numId w:val="46"/>
+        </w:numPr>
+      </w:pPr>
+      <w:r>
+        <w:t xml:space="preserve">If you are </w:t>
+      </w:r>
+      <w:r>
+        <w:t xml:space="preserve">file by </w:t>
+      </w:r>
+      <w:r>
+        <w:t xml:space="preserve">mailing your documents and </w:t>
+      </w:r>
+      <w:r>
+        <w:t xml:space="preserve">you </w:t>
+      </w:r>
+      <w:r>
+        <w:t xml:space="preserve">do not have access to a notary or court clerk, fill out and file </w:t>
       </w:r>
       <w:r>
         <w:rPr>
@@ -2093,7 +2173,7 @@
         <w:rFonts w:ascii="Symbol" w:eastAsiaTheme="minorHAnsi" w:hAnsi="Symbol" w:cs="Helvetica" w:hint="default"/>
       </w:rPr>
     </w:lvl>
-    <w:lvl w:ilvl="1" w:tplc="04090003" w:tentative="1">
+    <w:lvl w:ilvl="1" w:tplc="04090003">
       <w:start w:val="1"/>
       <w:numFmt w:val="bullet"/>
       <w:lvlText w:val="o"/>

</xml_diff>